<commit_message>
add: resumen pia 04, tarea pia05
</commit_message>
<xml_diff>
--- a/plantilla_IABD_A4_estilizada.docx
+++ b/plantilla_IABD_A4_estilizada.docx
@@ -25,7 +25,7 @@
         <w:rPr>
           <w:spacing w:val="-4"/>
         </w:rPr>
-        <w:t>3</w:t>
+        <w:t>5</w:t>
       </w:r>
     </w:p>
     <w:p>
@@ -461,7 +461,7 @@
                 <w:spacing w:val="-4"/>
                 <w:sz w:val="20"/>
               </w:rPr>
-              <w:t>3</w:t>
+              <w:t>5</w:t>
             </w:r>
           </w:p>
         </w:tc>
@@ -477,55 +477,6 @@
                 <w:sz w:val="20"/>
               </w:rPr>
             </w:pPr>
-            <w:r>
-              <w:rPr>
-                <w:spacing w:val="-2"/>
-                <w:sz w:val="20"/>
-              </w:rPr>
-              <w:t>1</w:t>
-            </w:r>
-            <w:r>
-              <w:rPr>
-                <w:spacing w:val="-2"/>
-                <w:sz w:val="20"/>
-              </w:rPr>
-              <w:t>6</w:t>
-            </w:r>
-            <w:r>
-              <w:rPr>
-                <w:spacing w:val="-2"/>
-                <w:sz w:val="20"/>
-              </w:rPr>
-              <w:t>/</w:t>
-            </w:r>
-            <w:r>
-              <w:rPr>
-                <w:spacing w:val="-2"/>
-                <w:sz w:val="20"/>
-              </w:rPr>
-              <w:t>0</w:t>
-            </w:r>
-            <w:r>
-              <w:rPr>
-                <w:spacing w:val="-2"/>
-                <w:sz w:val="20"/>
-              </w:rPr>
-              <w:t>2</w:t>
-            </w:r>
-            <w:r>
-              <w:rPr>
-                <w:spacing w:val="-2"/>
-                <w:sz w:val="20"/>
-              </w:rPr>
-              <w:t>/2</w:t>
-            </w:r>
-            <w:r>
-              <w:rPr>
-                <w:spacing w:val="-2"/>
-                <w:sz w:val="20"/>
-              </w:rPr>
-              <w:t>5</w:t>
-            </w:r>
           </w:p>
         </w:tc>
       </w:tr>
@@ -620,7 +571,7 @@
                 <w:spacing w:val="-4"/>
                 <w:sz w:val="20"/>
               </w:rPr>
-              <w:t>3</w:t>
+              <w:t>5</w:t>
             </w:r>
           </w:p>
         </w:tc>
@@ -636,34 +587,6 @@
                 <w:sz w:val="20"/>
               </w:rPr>
             </w:pPr>
-            <w:r>
-              <w:rPr>
-                <w:spacing w:val="-2"/>
-                <w:sz w:val="20"/>
-              </w:rPr>
-              <w:t>09</w:t>
-            </w:r>
-            <w:r>
-              <w:rPr>
-                <w:spacing w:val="-2"/>
-                <w:sz w:val="20"/>
-              </w:rPr>
-              <w:t>/0</w:t>
-            </w:r>
-            <w:r>
-              <w:rPr>
-                <w:spacing w:val="-2"/>
-                <w:sz w:val="20"/>
-              </w:rPr>
-              <w:t>2</w:t>
-            </w:r>
-            <w:r>
-              <w:rPr>
-                <w:spacing w:val="-2"/>
-                <w:sz w:val="20"/>
-              </w:rPr>
-              <w:t>/25</w:t>
-            </w:r>
           </w:p>
         </w:tc>
       </w:tr>
@@ -758,7 +681,7 @@
                 <w:spacing w:val="-4"/>
                 <w:sz w:val="20"/>
               </w:rPr>
-              <w:t>3</w:t>
+              <w:t>5</w:t>
             </w:r>
           </w:p>
         </w:tc>
@@ -793,7 +716,14 @@
                 <w:spacing w:val="-2"/>
                 <w:sz w:val="20"/>
               </w:rPr>
-              <w:t>01</w:t>
+              <w:t>0</w:t>
+            </w:r>
+            <w:r>
+              <w:rPr>
+                <w:spacing w:val="-2"/>
+                <w:sz w:val="20"/>
+              </w:rPr>
+              <w:t>2</w:t>
             </w:r>
             <w:r>
               <w:rPr>
@@ -883,7 +813,14 @@
                 <w:spacing w:val="-4"/>
                 <w:sz w:val="20"/>
               </w:rPr>
-              <w:t>UTO3</w:t>
+              <w:t>UTO</w:t>
+            </w:r>
+            <w:r>
+              <w:rPr>
+                <w:spacing w:val="-4"/>
+                <w:sz w:val="20"/>
+              </w:rPr>
+              <w:t>5</w:t>
             </w:r>
           </w:p>
         </w:tc>
@@ -904,7 +841,28 @@
                 <w:spacing w:val="-2"/>
                 <w:sz w:val="20"/>
               </w:rPr>
-              <w:t>07/02/25</w:t>
+              <w:t>09</w:t>
+            </w:r>
+            <w:r>
+              <w:rPr>
+                <w:spacing w:val="-2"/>
+                <w:sz w:val="20"/>
+              </w:rPr>
+              <w:t>/0</w:t>
+            </w:r>
+            <w:r>
+              <w:rPr>
+                <w:spacing w:val="-2"/>
+                <w:sz w:val="20"/>
+              </w:rPr>
+              <w:t>4</w:t>
+            </w:r>
+            <w:r>
+              <w:rPr>
+                <w:spacing w:val="-2"/>
+                <w:sz w:val="20"/>
+              </w:rPr>
+              <w:t>/25</w:t>
             </w:r>
           </w:p>
         </w:tc>
@@ -930,13 +888,7 @@
               <w:rPr>
                 <w:sz w:val="20"/>
               </w:rPr>
-              <w:t xml:space="preserve">[ </w:t>
-            </w:r>
-            <w:r>
-              <w:rPr>
-                <w:sz w:val="20"/>
-              </w:rPr>
-              <w:t xml:space="preserve"> </w:t>
+              <w:t xml:space="preserve">[  </w:t>
             </w:r>
             <w:r>
               <w:rPr>
@@ -993,7 +945,7 @@
                 <w:spacing w:val="-4"/>
                 <w:sz w:val="20"/>
               </w:rPr>
-              <w:t>3</w:t>
+              <w:t>5</w:t>
             </w:r>
           </w:p>
         </w:tc>
@@ -1009,6 +961,41 @@
                 <w:sz w:val="20"/>
               </w:rPr>
             </w:pPr>
+            <w:r>
+              <w:rPr>
+                <w:spacing w:val="-2"/>
+                <w:sz w:val="20"/>
+              </w:rPr>
+              <w:t>0</w:t>
+            </w:r>
+            <w:r>
+              <w:rPr>
+                <w:spacing w:val="-2"/>
+                <w:sz w:val="20"/>
+              </w:rPr>
+              <w:t>6</w:t>
+            </w:r>
+            <w:r>
+              <w:rPr>
+                <w:spacing w:val="-2"/>
+                <w:sz w:val="20"/>
+              </w:rPr>
+              <w:t>/0</w:t>
+            </w:r>
+            <w:r>
+              <w:rPr>
+                <w:spacing w:val="-2"/>
+                <w:sz w:val="20"/>
+              </w:rPr>
+              <w:t>4</w:t>
+            </w:r>
+            <w:r>
+              <w:rPr>
+                <w:spacing w:val="-2"/>
+                <w:sz w:val="20"/>
+              </w:rPr>
+              <w:t>/25</w:t>
+            </w:r>
           </w:p>
         </w:tc>
       </w:tr>
@@ -1299,7 +1286,14 @@
                 <w:spacing w:val="-4"/>
                 <w:sz w:val="20"/>
               </w:rPr>
-              <w:t>UTO3</w:t>
+              <w:t>UTO</w:t>
+            </w:r>
+            <w:r>
+              <w:rPr>
+                <w:spacing w:val="-4"/>
+                <w:sz w:val="20"/>
+              </w:rPr>
+              <w:t>5</w:t>
             </w:r>
           </w:p>
         </w:tc>
@@ -1336,13 +1330,6 @@
                 <w:sz w:val="20"/>
               </w:rPr>
             </w:pPr>
-            <w:r>
-              <w:rPr>
-                <w:spacing w:val="-2"/>
-                <w:sz w:val="20"/>
-              </w:rPr>
-              <w:t>16/02/25</w:t>
-            </w:r>
           </w:p>
         </w:tc>
       </w:tr>
@@ -1417,7 +1404,14 @@
                 <w:spacing w:val="-4"/>
                 <w:sz w:val="20"/>
               </w:rPr>
-              <w:t>UTO3</w:t>
+              <w:t>UTO</w:t>
+            </w:r>
+            <w:r>
+              <w:rPr>
+                <w:spacing w:val="-4"/>
+                <w:sz w:val="20"/>
+              </w:rPr>
+              <w:t>5</w:t>
             </w:r>
           </w:p>
         </w:tc>
@@ -1454,13 +1448,6 @@
                 <w:sz w:val="20"/>
               </w:rPr>
             </w:pPr>
-            <w:r>
-              <w:rPr>
-                <w:spacing w:val="-2"/>
-                <w:sz w:val="20"/>
-              </w:rPr>
-              <w:t>09/02/25</w:t>
-            </w:r>
           </w:p>
         </w:tc>
       </w:tr>
@@ -1535,7 +1522,7 @@
                 <w:spacing w:val="-4"/>
                 <w:sz w:val="20"/>
               </w:rPr>
-              <w:t>UTO3</w:t>
+              <w:t>UTO5</w:t>
             </w:r>
           </w:p>
         </w:tc>
@@ -1577,7 +1564,7 @@
                 <w:spacing w:val="-2"/>
                 <w:sz w:val="20"/>
               </w:rPr>
-              <w:t>23/01/25</w:t>
+              <w:t>23/02/25</w:t>
             </w:r>
           </w:p>
         </w:tc>
@@ -1653,14 +1640,7 @@
                 <w:spacing w:val="-4"/>
                 <w:sz w:val="20"/>
               </w:rPr>
-              <w:t>UTO</w:t>
-            </w:r>
-            <w:r>
-              <w:rPr>
-                <w:spacing w:val="-4"/>
-                <w:sz w:val="20"/>
-              </w:rPr>
-              <w:t>3</w:t>
+              <w:t>UTO5</w:t>
             </w:r>
           </w:p>
         </w:tc>
@@ -1702,35 +1682,7 @@
                 <w:spacing w:val="-2"/>
                 <w:sz w:val="20"/>
               </w:rPr>
-              <w:t>0</w:t>
-            </w:r>
-            <w:r>
-              <w:rPr>
-                <w:spacing w:val="-2"/>
-                <w:sz w:val="20"/>
-              </w:rPr>
-              <w:t>7</w:t>
-            </w:r>
-            <w:r>
-              <w:rPr>
-                <w:spacing w:val="-2"/>
-                <w:sz w:val="20"/>
-              </w:rPr>
-              <w:t>/0</w:t>
-            </w:r>
-            <w:r>
-              <w:rPr>
-                <w:spacing w:val="-2"/>
-                <w:sz w:val="20"/>
-              </w:rPr>
-              <w:t>2</w:t>
-            </w:r>
-            <w:r>
-              <w:rPr>
-                <w:spacing w:val="-2"/>
-                <w:sz w:val="20"/>
-              </w:rPr>
-              <w:t>/25</w:t>
+              <w:t>09/04/25</w:t>
             </w:r>
           </w:p>
         </w:tc>
@@ -1806,7 +1758,7 @@
                 <w:spacing w:val="-4"/>
                 <w:sz w:val="20"/>
               </w:rPr>
-              <w:t>UTO2</w:t>
+              <w:t>UTO5</w:t>
             </w:r>
           </w:p>
         </w:tc>
@@ -1843,6 +1795,13 @@
                 <w:sz w:val="20"/>
               </w:rPr>
             </w:pPr>
+            <w:r>
+              <w:rPr>
+                <w:spacing w:val="-2"/>
+                <w:sz w:val="20"/>
+              </w:rPr>
+              <w:t>06/04/25</w:t>
+            </w:r>
           </w:p>
         </w:tc>
       </w:tr>
@@ -2150,7 +2109,7 @@
                 <w:spacing w:val="-4"/>
                 <w:sz w:val="20"/>
               </w:rPr>
-              <w:t>3</w:t>
+              <w:t>5</w:t>
             </w:r>
           </w:p>
         </w:tc>
@@ -2293,7 +2252,7 @@
                 <w:spacing w:val="-4"/>
                 <w:sz w:val="20"/>
               </w:rPr>
-              <w:t>3</w:t>
+              <w:t>5</w:t>
             </w:r>
           </w:p>
         </w:tc>
@@ -2436,7 +2395,7 @@
                 <w:spacing w:val="-4"/>
                 <w:sz w:val="20"/>
               </w:rPr>
-              <w:t>3</w:t>
+              <w:t>5</w:t>
             </w:r>
           </w:p>
         </w:tc>
@@ -2579,7 +2538,7 @@
                 <w:spacing w:val="-4"/>
                 <w:sz w:val="20"/>
               </w:rPr>
-              <w:t>3</w:t>
+              <w:t>5</w:t>
             </w:r>
           </w:p>
         </w:tc>
@@ -2722,7 +2681,7 @@
                 <w:spacing w:val="-4"/>
                 <w:sz w:val="20"/>
               </w:rPr>
-              <w:t>3</w:t>
+              <w:t>5</w:t>
             </w:r>
           </w:p>
         </w:tc>

</xml_diff>